<commit_message>
Changed text clause 6
</commit_message>
<xml_diff>
--- a/contract_files/models/Contrato Compra e Venda de Terreno.docx
+++ b/contract_files/models/Contrato Compra e Venda de Terreno.docx
@@ -985,7 +985,22 @@
           <w:szCs w:val="22"/>
           <w:lang w:val="pt-BR"/>
         </w:rPr>
-        <w:t xml:space="preserve">CLÁUSULA SEXTA - DA RESPONSABILIDADE DA VENDEDORA/CEDENTE</w:t>
+        <w:t xml:space="preserve">CLÁUSULA SEXTA - DA RESPONSABILIDADE </w:t>
+      </w:r>
+      <w:r>
+        <w:rPr>
+          <w:sz w:val="22"/>
+          <w:szCs w:val="22"/>
+          <w:lang w:val="pt-BR"/>
+        </w:rPr>
+      </w:r>
+      <w:r>
+        <w:rPr>
+          <w:sz w:val="22"/>
+          <w:szCs w:val="22"/>
+          <w:lang w:val="pt-BR"/>
+        </w:rPr>
+        <w:t xml:space="preserve">DO(A) VENDEDOR(A)/CEDENTE</w:t>
       </w:r>
       <w:r>
         <w:rPr>

</xml_diff>